<commit_message>
CS1105 Unit 3: tidy discussion - sharpen Q1/Q3, tighten to 749 words
Deepen Q1 (explicit weighted-bit info + edge-triggered stability), Q3 (JK
as superset of T, two concrete circuit changes with set/reset examples),
tighten prose to stay within the 500-750 word limit; sync md and docx.
</commit_message>
<xml_diff>
--- a/CS1105_Digital_Electronics_Architecture/Unit3_Sequential_Logic/Discussion/Unit3_Discussion_Post.docx
+++ b/CS1105_Digital_Electronics_Architecture/Unit3_Sequential_Logic/Discussion/Unit3_Discussion_Post.docx
@@ -190,7 +190,7 @@
           <w:b w:val="0"/>
           <w:sz w:val="24"/>
         </w:rPr>
-        <w:t>Designing the arcade game's control circuit is a good use of sequential logic, because unlike combinational circuits, sequential circuits use memory elements (flip-flops) whose outputs depend on both the current inputs and the stored past state, driven by a clock (Ndjountche, 2016). The score must be remembered and updated, and the lights and sound must toggle on game events, so flip-flops are the right building blocks. Below I address the score counter, the lights and sound control, and how the design would change with JK flip-flops.</w:t>
+        <w:t>The arcade game's control circuit is a good use of sequential logic: unlike combinational circuits, sequential circuits use memory elements (flip-flops) whose outputs depend on both the current inputs and the stored past state, driven by a clock (Ndjountche, 2016). The score must be remembered and updated, and the lights and sound must toggle on events, so flip-flops are the right components.</w:t>
       </w:r>
     </w:p>
     <w:p>
@@ -219,7 +219,7 @@
           <w:b w:val="0"/>
           <w:sz w:val="24"/>
         </w:rPr>
-        <w:t>A binary counter for the player's score can be built from D flip-flops, one per bit of the score. A D flip-flop copies its D input to its output Q on the active clock edge, so it holds one bit until the next update (Ndjountche, 2016). To count, the stages are connected so each toggles at the right time: in a simple ripple counter the first flip-flop is fed its own inverted output (D0 = NOT Q0) so it flips every clock pulse, and each following stage is clocked by the previous stage's output, so it toggles only when the lower bits roll over. Together the outputs Q0, Q1, Q2, ... form the binary score. Each D flip-flop stores exactly one bit: Q0 is the least-significant bit (value 1), Q1 the next (value 2), Q2 the next (value 4), and so on. Four D flip-flops store scores 0000 to 1111 (0 to 15), and adding flip-flops widens the range. Each flip-flop stores a single binary digit, and together they hold the whole score value that persists between clock pulses.</w:t>
+        <w:t>A binary counter for the player's score can be built from D flip-flops, one per bit of the score. A D flip-flop copies its D input to its output Q on the active clock edge, so it holds one bit until the next update (Ndjountche, 2016). To count, the stages are connected so each toggles at the right time: in a simple ripple counter the first flip-flop is fed its own inverted output (D0 = NOT Q0) so it flips every clock pulse, and each following stage is clocked by the previous stage's output, so it toggles only when the lower bits roll over. The outputs Q0, Q1, Q2, ... form the binary score, and each flip-flop stores one bit: Q0 the least-significant bit (value 1), Q1 the next (value 2), Q2 the next (value 4), and so on. Four D flip-flops store scores 0000 to 1111 (0 to 15), and adding flip-flops widens the range. So the information in each D flip-flop is one weighted binary digit of the current score, and together they store the whole score as a binary number that, because the flip-flops are edge-triggered, stays stable between clock pulses (Ndjountche, 2016).</w:t>
       </w:r>
     </w:p>
     <w:p>
@@ -248,7 +248,7 @@
           <w:b w:val="0"/>
           <w:sz w:val="24"/>
         </w:rPr>
-        <w:t>T (toggle) flip-flops are the natural choice for the flashing lights and sound effects, because a T flip-flop with T held at 1 flips its output on every clock pulse, producing a steady on-off-on-off pattern (Ndjountche, 2016). I would use a T flip-flop for each light that needs to blink: tying T high and clocking it from a slow pulse makes the light flash at a regular rate. For an event-driven effect, T becomes the control: setting T = 1 only when a game event occurs (for example, a bonus is hit) lets that event toggle a light or a sound-enable line, while T = 0 holds the current state. T flip-flops are therefore well suited to "switch this on or off each time something happens," which is exactly the behavior wanted for blinking indicators and toggled sound effects.</w:t>
+        <w:t>T (toggle) flip-flops are the natural choice for the flashing lights and sound effects, because a T flip-flop with T held at 1 flips its output on every clock pulse, producing a steady on-off pattern (Ndjountche, 2016). I would use one T flip-flop per light that needs to blink: tying T high and clocking it from a slow pulse makes the light flash at a regular rate. For an event-driven effect, T becomes the control - setting T = 1 only when a game event occurs (say, a bonus is hit) lets that event toggle a light or a sound-enable line, while T = 0 holds the current state. T flip-flops thus fit any "flip this on or off each time something happens" behavior, which is exactly what blinking indicators and toggled sound effects need.</w:t>
       </w:r>
     </w:p>
     <w:p>
@@ -277,7 +277,7 @@
           <w:b w:val="0"/>
           <w:sz w:val="24"/>
         </w:rPr>
-        <w:t>A JK flip-flop is the most flexible of the three: with inputs J and K it can set (J = 1, K = 0), reset (J = 0, K = 1), hold (J = K = 0), or toggle (J = K = 1) on the clock edge (Mano &amp; Ciletti, 2018). The key difference is that a T flip-flop has a single input and can only toggle or hold, whereas a JK flip-flop can also independently force the output on or off. Using JK flip-flops for the lights and sound would add that control but require two inputs instead of one. To reproduce a T flip-flop's toggling, I would tie J and K together (J = K = T), since J = K = 1 toggles and J = K = 0 holds, so a JK flip-flop with joined inputs behaves as a T flip-flop (Ndjountche, 2016). The main change is the extra input line and its control logic, which also enables using set/reset to force all effect lights off instantly at game over (J = 0, K = 1) rather than waiting for a toggle.</w:t>
+        <w:t>A JK flip-flop is the most flexible of the three: with inputs J and K it can set (J = 1, K = 0), reset (J = 0, K = 1), hold (J = K = 0), or toggle (J = K = 1) on the clock edge (Mano &amp; Ciletti, 2018). The key behavioral difference is that a T flip-flop has one input and can only toggle or hold, so a single pulse merely inverts its current state, whereas a JK can also deterministically force the output on or off. In effect the JK is a superset of the T. To reproduce pure toggling I would tie J = K = T, since J = K = 1 toggles and J = K = 0 holds, so a JK with joined inputs acts as a T flip-flop (Ndjountche, 2016). Two circuit changes follow. First, each effect flip-flop now needs two control lines instead of one, so I would add a little combinational logic to drive J and K from the game-event signals. Second, I could use that control for exact states rather than toggles - for example, J = 1, K = 0 to force a warning light on when time is low, and J = 0, K = 1 to force all lights off at game over, instead of hoping a toggle lands right (Mano &amp; Ciletti, 2018). The trade-off is more wiring for finer control.</w:t>
       </w:r>
     </w:p>
     <w:p>
@@ -306,7 +306,7 @@
           <w:b w:val="0"/>
           <w:sz w:val="24"/>
         </w:rPr>
-        <w:t>In short, D flip-flops build the score counter (one bit each), T flip-flops efficiently toggle the lights and sound, and JK flip-flops offer the same toggling plus independent set/reset at the price of an extra input. The right choice depends on how much control each part of the game needs.</w:t>
+        <w:t>In short, D flip-flops build the score counter (one bit each), T flip-flops toggle the lights and sound, and JK flip-flops add independent set/reset at the cost of an extra input, so the choice depends on how much control each part needs.</w:t>
       </w:r>
     </w:p>
     <w:p>
@@ -334,7 +334,7 @@
           <w:b w:val="0"/>
           <w:sz w:val="24"/>
         </w:rPr>
-        <w:t>Word count: 725</w:t>
+        <w:t>Word count: 749</w:t>
       </w:r>
     </w:p>
     <w:p>

</xml_diff>